<commit_message>
fix: improve statistical teaching, sidebar layout and demo coverage
Correct uncertainty diagnostics, constrained allocation, planning prerequisites and teaching materials. Keep workspace sidebars within the viewport and simplify the student task hall.

Add the diverse demo research catalog, independent review evidence and deployment records. Validated with 827 passing tests, type/style checks, demo builds, real API probes and browser checks.
</commit_message>
<xml_diff>
--- a/public/templates/调查问卷设计规范与模板.docx
+++ b/public/templates/调查问卷设计规范与模板.docx
@@ -22,7 +22,7 @@
       </w:pPr>
       <w:r>
         <w:rPr/>
-        <w:t>本模板用于统计学虚拟仿真实验的问卷认知预试。请根据研究问题、目标总体和分析单位改写占位内容；预试答案用于检查题意和作答体验，不直接进入后续总体抽样估计。</w:t>
+        <w:t>本模板用于统计学虚拟仿真实验的受访者视角试填。请根据研究问题、目标总体和分析单位改写占位内容；试填答案用于交互自检，不进入后续总体抽样估计。完成自填不代表通过认知预试、信度或效度验证。</w:t>
       </w:r>
     </w:p>
     <w:p>
@@ -1187,7 +1187,7 @@
       </w:pPr>
       <w:r>
         <w:rPr/>
-        <w:t xml:space="preserve">是否由目标人群代表完成一次认知预试，并记录难懂、犹豫或误解的位置？ </w:t>
+        <w:t xml:space="preserve">课堂交互自检：是否完整试填、检查选项和作答流程？若开展正式认知预试，还需邀请目标人群代表，记录对题意的理解、追问、犹豫或误解的位置以及修改依据；平台的试填完成状态不代替这些证据。 </w:t>
       </w:r>
     </w:p>
     <w:sectPr>

</xml_diff>

<commit_message>
fix: improve statistical planning and exact design analysis
Compute stable exact PPS design standard errors and normalize categorical comparisons across the full category space.

Validate advanced planning snapshots, correct cost and questionnaire guidance, and display snapshot timestamps in China Standard Time.

Include statistical review evidence and fresh deployment dogfood results. Verified with bun run verify and student/teacher browser checks.
</commit_message>
<xml_diff>
--- a/public/templates/调查问卷设计规范与模板.docx
+++ b/public/templates/调查问卷设计规范与模板.docx
@@ -4,13 +4,19 @@
   <w:body>
     <w:p>
       <w:pPr>
-        <w:pStyle w:val="Heading1"/>
-        <w:bidi w:val="0"/>
-        <w:spacing w:before="240" w:after="227"/>
-        <w:rPr/>
-      </w:pPr>
-      <w:r>
-        <w:rPr/>
+        <w:pStyle w:val="Title"/>
+        <w:keepNext/>
+        <w:bidi w:val="0"/>
+        <w:spacing w:before="200" w:after="120"/>
+        <w:ind w:left="0" w:right="0"/>
+        <w:jc w:val="center"/>
+        <w:rPr/>
+      </w:pPr>
+      <w:r>
+        <w:rPr>
+          <w:color w:val="000000"/>
+          <w:sz w:val="40"/>
+        </w:rPr>
         <w:t>调查问卷设计规范与模板</w:t>
       </w:r>
     </w:p>
@@ -18,21 +24,31 @@
       <w:pPr>
         <w:pStyle w:val="BodyTextnote"/>
         <w:bidi w:val="0"/>
-        <w:rPr/>
-      </w:pPr>
-      <w:r>
-        <w:rPr/>
+        <w:spacing w:after="120"/>
+        <w:ind w:left="0" w:right="0"/>
+        <w:rPr/>
+      </w:pPr>
+      <w:r>
+        <w:rPr>
+          <w:color w:val="000000"/>
+        </w:rPr>
         <w:t>本模板用于统计学虚拟仿真实验的受访者视角试填。请根据研究问题、目标总体和分析单位改写占位内容；试填答案用于交互自检，不进入后续总体抽样估计。完成自填不代表通过认知预试、信度或效度验证。</w:t>
       </w:r>
     </w:p>
     <w:p>
       <w:pPr>
         <w:pStyle w:val="Heading2"/>
-        <w:bidi w:val="0"/>
-        <w:rPr/>
-      </w:pPr>
-      <w:r>
-        <w:rPr/>
+        <w:keepNext/>
+        <w:bidi w:val="0"/>
+        <w:spacing w:after="120" w:before="200"/>
+        <w:ind w:left="0" w:right="0"/>
+        <w:rPr/>
+      </w:pPr>
+      <w:r>
+        <w:rPr>
+          <w:color w:val="000000"/>
+          <w:sz w:val="28"/>
+        </w:rPr>
         <w:t>一、封面信与填写说明</w:t>
       </w:r>
     </w:p>
@@ -40,18 +56,20 @@
       <w:pPr>
         <w:pStyle w:val="BodyText"/>
         <w:bidi w:val="0"/>
-        <w:ind w:hanging="0" w:start="0" w:end="0"/>
+        <w:spacing w:after="120"/>
+        <w:ind w:hanging="0" w:start="0" w:end="0" w:left="0" w:right="0"/>
         <w:rPr/>
       </w:pPr>
       <w:r>
         <w:rPr>
           <w:rStyle w:val="Strong"/>
+          <w:color w:val="000000"/>
         </w:rPr>
         <w:t>问卷标题：</w:t>
       </w:r>
       <w:r>
         <w:rPr>
-          <w:color w:val="4F657D"/>
+          <w:color w:val="000000"/>
         </w:rPr>
         <w:t>关于【研究主题】的调查问卷</w:t>
       </w:r>
@@ -60,75 +78,86 @@
       <w:pPr>
         <w:pStyle w:val="BodyText"/>
         <w:bidi w:val="0"/>
-        <w:ind w:hanging="0" w:start="0" w:end="0"/>
-        <w:rPr/>
-      </w:pPr>
-      <w:r>
-        <w:rPr/>
+        <w:spacing w:after="120"/>
+        <w:ind w:hanging="0" w:start="0" w:end="0" w:left="0" w:right="0"/>
+        <w:rPr/>
+      </w:pPr>
+      <w:r>
+        <w:rPr>
+          <w:color w:val="000000"/>
+        </w:rPr>
         <w:t>您好！我们正在开展</w:t>
       </w:r>
       <w:r>
         <w:rPr>
-          <w:color w:val="4F657D"/>
+          <w:color w:val="000000"/>
         </w:rPr>
         <w:t>【调查目的】</w:t>
       </w:r>
       <w:r>
-        <w:rPr/>
+        <w:rPr>
+          <w:color w:val="000000"/>
+        </w:rPr>
         <w:t>。本问卷面向</w:t>
       </w:r>
       <w:r>
         <w:rPr>
-          <w:color w:val="4F657D"/>
+          <w:color w:val="000000"/>
         </w:rPr>
         <w:t>【目标人群】</w:t>
       </w:r>
       <w:r>
-        <w:rPr/>
+        <w:rPr>
+          <w:color w:val="000000"/>
+        </w:rPr>
         <w:t>，预计用时</w:t>
       </w:r>
       <w:r>
         <w:rPr>
-          <w:color w:val="4F657D"/>
+          <w:color w:val="000000"/>
         </w:rPr>
         <w:t>【</w:t>
       </w:r>
       <w:r>
         <w:rPr>
-          <w:color w:val="4F657D"/>
+          <w:color w:val="000000"/>
         </w:rPr>
         <w:t>3–5</w:t>
       </w:r>
       <w:r>
         <w:rPr>
-          <w:color w:val="4F657D"/>
+          <w:color w:val="000000"/>
         </w:rPr>
         <w:t>】</w:t>
       </w:r>
       <w:r>
-        <w:rPr/>
+        <w:rPr>
+          <w:color w:val="000000"/>
+        </w:rPr>
         <w:t>分钟。参与完全自愿，您可以跳过不愿回答的问题或随时退出。数据仅用于</w:t>
       </w:r>
       <w:r>
         <w:rPr>
-          <w:color w:val="4F657D"/>
+          <w:color w:val="000000"/>
         </w:rPr>
         <w:t>【教学</w:t>
       </w:r>
       <w:r>
         <w:rPr>
-          <w:color w:val="4F657D"/>
+          <w:color w:val="000000"/>
         </w:rPr>
         <w:t>/</w:t>
       </w:r>
       <w:r>
         <w:rPr>
-          <w:color w:val="4F657D"/>
+          <w:color w:val="000000"/>
         </w:rPr>
         <w:t>研究用途】</w:t>
       </w:r>
       <w:r>
-        <w:rPr/>
+        <w:rPr>
+          <w:color w:val="000000"/>
+        </w:rPr>
         <w:t>，结果将以汇总形式呈现，不收集与研究无关的身份信息。</w:t>
       </w:r>
     </w:p>
@@ -136,27 +165,38 @@
       <w:pPr>
         <w:pStyle w:val="BodyText"/>
         <w:bidi w:val="0"/>
+        <w:spacing w:after="120"/>
+        <w:ind w:left="0" w:right="0"/>
         <w:rPr/>
       </w:pPr>
       <w:r>
         <w:rPr>
           <w:rStyle w:val="Strong"/>
+          <w:color w:val="000000"/>
         </w:rPr>
         <w:t>填写方法：</w:t>
       </w:r>
       <w:r>
-        <w:rPr/>
+        <w:rPr>
+          <w:color w:val="000000"/>
+        </w:rPr>
         <w:t>除特别说明外，请选择最符合实际情况的答案。涉及频率或经历的题目必须注明统一时间范围。</w:t>
       </w:r>
     </w:p>
     <w:p>
       <w:pPr>
         <w:pStyle w:val="Heading2"/>
-        <w:bidi w:val="0"/>
-        <w:rPr/>
-      </w:pPr>
-      <w:r>
-        <w:rPr/>
+        <w:keepNext/>
+        <w:bidi w:val="0"/>
+        <w:spacing w:after="120" w:before="200"/>
+        <w:ind w:left="0" w:right="0"/>
+        <w:rPr/>
+      </w:pPr>
+      <w:r>
+        <w:rPr>
+          <w:color w:val="000000"/>
+          <w:sz w:val="28"/>
+        </w:rPr>
         <w:t>二、甄别题</w:t>
       </w:r>
     </w:p>
@@ -164,10 +204,14 @@
       <w:pPr>
         <w:pStyle w:val="BodyText"/>
         <w:bidi w:val="0"/>
-        <w:rPr/>
-      </w:pPr>
-      <w:r>
-        <w:rPr/>
+        <w:spacing w:after="120"/>
+        <w:ind w:left="0" w:right="0"/>
+        <w:rPr/>
+      </w:pPr>
+      <w:r>
+        <w:rPr>
+          <w:color w:val="000000"/>
+        </w:rPr>
         <w:t>甄别题用于判断答题者是否属于目标总体，不应被用来诱导答案。</w:t>
       </w:r>
     </w:p>
@@ -183,22 +227,26 @@
           <w:tab w:val="left" w:pos="709" w:leader="none"/>
         </w:tabs>
         <w:bidi w:val="0"/>
-        <w:spacing w:before="0" w:after="0"/>
-        <w:ind w:hanging="283" w:start="709" w:end="0"/>
-        <w:rPr/>
-      </w:pPr>
-      <w:r>
-        <w:rPr/>
+        <w:spacing w:before="0" w:after="120"/>
+        <w:ind w:hanging="283" w:start="709" w:end="0" w:left="0" w:right="0"/>
+        <w:rPr/>
+      </w:pPr>
+      <w:r>
+        <w:rPr>
+          <w:color w:val="000000"/>
+        </w:rPr>
         <w:t>您是否属于</w:t>
       </w:r>
       <w:r>
         <w:rPr>
-          <w:color w:val="4F657D"/>
+          <w:color w:val="000000"/>
         </w:rPr>
         <w:t>【目标人群定义】</w:t>
       </w:r>
       <w:r>
-        <w:rPr/>
+        <w:rPr>
+          <w:color w:val="000000"/>
+        </w:rPr>
         <w:t xml:space="preserve">？　□ 是　□ 否 </w:t>
       </w:r>
     </w:p>
@@ -214,43 +262,50 @@
           <w:tab w:val="left" w:pos="709" w:leader="none"/>
         </w:tabs>
         <w:bidi w:val="0"/>
-        <w:ind w:hanging="283" w:start="709" w:end="0"/>
-        <w:rPr/>
-      </w:pPr>
-      <w:r>
-        <w:rPr/>
+        <w:spacing w:after="120"/>
+        <w:ind w:hanging="283" w:start="709" w:end="0" w:left="0" w:right="0"/>
+        <w:rPr/>
+      </w:pPr>
+      <w:r>
+        <w:rPr>
+          <w:color w:val="000000"/>
+        </w:rPr>
         <w:t>在过去</w:t>
       </w:r>
       <w:r>
         <w:rPr>
-          <w:color w:val="4F657D"/>
+          <w:color w:val="000000"/>
         </w:rPr>
         <w:t>【明确时间范围】</w:t>
       </w:r>
       <w:r>
-        <w:rPr/>
+        <w:rPr>
+          <w:color w:val="000000"/>
+        </w:rPr>
         <w:t>内，您是否有过</w:t>
       </w:r>
       <w:r>
         <w:rPr>
-          <w:color w:val="4F657D"/>
+          <w:color w:val="000000"/>
         </w:rPr>
         <w:t>【目标行为</w:t>
       </w:r>
       <w:r>
         <w:rPr>
-          <w:color w:val="4F657D"/>
+          <w:color w:val="000000"/>
         </w:rPr>
         <w:t>/</w:t>
       </w:r>
       <w:r>
         <w:rPr>
-          <w:color w:val="4F657D"/>
+          <w:color w:val="000000"/>
         </w:rPr>
         <w:t>经历】</w:t>
       </w:r>
       <w:r>
-        <w:rPr/>
+        <w:rPr>
+          <w:color w:val="000000"/>
+        </w:rPr>
         <w:t xml:space="preserve">？　□ 是　□ 否 </w:t>
       </w:r>
     </w:p>
@@ -258,28 +313,38 @@
       <w:pPr>
         <w:pStyle w:val="BodyTextplaceholder"/>
         <w:bidi w:val="0"/>
-        <w:rPr/>
-      </w:pPr>
-      <w:r>
-        <w:rPr/>
+        <w:spacing w:after="120"/>
+        <w:ind w:left="0" w:right="0"/>
+        <w:rPr/>
+      </w:pPr>
+      <w:r>
+        <w:rPr>
+          <w:color w:val="000000"/>
+        </w:rPr>
         <w:t>如回答“否”不符合研究范围，应在正式问卷中设置结束逻辑；本实验预试可继续查看题目以检查表达。</w:t>
       </w:r>
     </w:p>
     <w:p>
       <w:pPr>
         <w:pStyle w:val="Heading2"/>
-        <w:bidi w:val="0"/>
-        <w:rPr/>
-      </w:pPr>
-      <w:r>
-        <w:rPr/>
+        <w:keepNext/>
+        <w:bidi w:val="0"/>
+        <w:spacing w:after="120" w:before="200"/>
+        <w:ind w:left="0" w:right="0"/>
+        <w:rPr/>
+      </w:pPr>
+      <w:r>
+        <w:rPr>
+          <w:color w:val="000000"/>
+          <w:sz w:val="28"/>
+        </w:rPr>
         <w:t>三、主体问题</w:t>
       </w:r>
     </w:p>
     <w:tbl>
       <w:tblPr>
-        <w:tblW w:w="11339" w:type="dxa"/>
-        <w:jc w:val="start"/>
+        <w:tblW w:w="9411" w:type="dxa"/>
+        <w:jc w:val="center"/>
         <w:tblInd w:w="0" w:type="dxa"/>
         <w:tblLayout w:type="fixed"/>
         <w:tblCellMar>
@@ -290,456 +355,813 @@
         </w:tblCellMar>
       </w:tblPr>
       <w:tblGrid>
-        <w:gridCol w:w="2255"/>
-        <w:gridCol w:w="5181"/>
-        <w:gridCol w:w="3903"/>
+        <w:gridCol w:w="1928"/>
+        <w:gridCol w:w="4195"/>
+        <w:gridCol w:w="3288"/>
       </w:tblGrid>
       <w:tr>
         <w:trPr>
           <w:tblHeader w:val="true"/>
+          <w:cantSplit/>
         </w:trPr>
         <w:tc>
           <w:tcPr>
-            <w:tcW w:w="2255" w:type="dxa"/>
-            <w:tcBorders/>
+            <w:tcW w:w="1928" w:type="dxa"/>
             <w:vAlign w:val="center"/>
+            <w:tcBorders>
+              <w:top w:val="single" w:sz="4" w:color="D9D9D9"/>
+              <w:left w:val="single" w:sz="4" w:color="D9D9D9"/>
+              <w:bottom w:val="single" w:sz="4" w:color="D9D9D9"/>
+              <w:right w:val="single" w:sz="4" w:color="D9D9D9"/>
+            </w:tcBorders>
+            <w:tcMar>
+              <w:top w:w="100" w:type="dxa"/>
+              <w:left w:w="100" w:type="dxa"/>
+              <w:bottom w:w="100" w:type="dxa"/>
+              <w:right w:w="100" w:type="dxa"/>
+            </w:tcMar>
+            <w:shd w:fill="E4EEF9"/>
           </w:tcPr>
           <w:p>
             <w:pPr>
               <w:pStyle w:val="TableHeading"/>
+              <w:keepNext w:val="0"/>
               <w:suppressLineNumbers/>
               <w:shd w:fill="E4EEF9" w:val="clear"/>
               <w:bidi w:val="0"/>
-              <w:spacing w:before="0" w:after="283"/>
+              <w:spacing w:before="0" w:after="0" w:line="300" w:lineRule="auto"/>
+              <w:ind w:left="0" w:right="0" w:firstLine="0"/>
               <w:jc w:val="center"/>
               <w:rPr/>
             </w:pPr>
             <w:r>
-              <w:rPr/>
+              <w:rPr>
+                <w:color w:val="000000"/>
+                <w:sz w:val="22"/>
+              </w:rPr>
               <w:t>测量目的</w:t>
             </w:r>
           </w:p>
         </w:tc>
         <w:tc>
           <w:tcPr>
-            <w:tcW w:w="5181" w:type="dxa"/>
-            <w:tcBorders/>
+            <w:tcW w:w="4195" w:type="dxa"/>
             <w:vAlign w:val="center"/>
+            <w:tcBorders>
+              <w:top w:val="single" w:sz="4" w:color="D9D9D9"/>
+              <w:left w:val="single" w:sz="4" w:color="D9D9D9"/>
+              <w:bottom w:val="single" w:sz="4" w:color="D9D9D9"/>
+              <w:right w:val="single" w:sz="4" w:color="D9D9D9"/>
+            </w:tcBorders>
+            <w:tcMar>
+              <w:top w:w="100" w:type="dxa"/>
+              <w:left w:w="100" w:type="dxa"/>
+              <w:bottom w:w="100" w:type="dxa"/>
+              <w:right w:w="100" w:type="dxa"/>
+            </w:tcMar>
+            <w:shd w:fill="E4EEF9"/>
           </w:tcPr>
           <w:p>
             <w:pPr>
               <w:pStyle w:val="TableHeading"/>
+              <w:keepNext w:val="0"/>
               <w:suppressLineNumbers/>
               <w:shd w:fill="E4EEF9" w:val="clear"/>
               <w:bidi w:val="0"/>
-              <w:spacing w:before="0" w:after="283"/>
+              <w:spacing w:before="0" w:after="0" w:line="300" w:lineRule="auto"/>
+              <w:ind w:left="0" w:right="0" w:firstLine="0"/>
               <w:jc w:val="center"/>
               <w:rPr/>
             </w:pPr>
             <w:r>
-              <w:rPr/>
+              <w:rPr>
+                <w:color w:val="000000"/>
+                <w:sz w:val="22"/>
+              </w:rPr>
               <w:t>示例题目</w:t>
             </w:r>
           </w:p>
         </w:tc>
         <w:tc>
           <w:tcPr>
-            <w:tcW w:w="3903" w:type="dxa"/>
-            <w:tcBorders/>
+            <w:tcW w:w="3288" w:type="dxa"/>
             <w:vAlign w:val="center"/>
+            <w:tcBorders>
+              <w:top w:val="single" w:sz="4" w:color="D9D9D9"/>
+              <w:left w:val="single" w:sz="4" w:color="D9D9D9"/>
+              <w:bottom w:val="single" w:sz="4" w:color="D9D9D9"/>
+              <w:right w:val="single" w:sz="4" w:color="D9D9D9"/>
+            </w:tcBorders>
+            <w:tcMar>
+              <w:top w:w="100" w:type="dxa"/>
+              <w:left w:w="100" w:type="dxa"/>
+              <w:bottom w:w="100" w:type="dxa"/>
+              <w:right w:w="100" w:type="dxa"/>
+            </w:tcMar>
+            <w:shd w:fill="E4EEF9"/>
           </w:tcPr>
           <w:p>
             <w:pPr>
               <w:pStyle w:val="TableHeading"/>
+              <w:keepNext w:val="0"/>
               <w:suppressLineNumbers/>
               <w:shd w:fill="E4EEF9" w:val="clear"/>
               <w:bidi w:val="0"/>
-              <w:spacing w:before="0" w:after="283"/>
+              <w:spacing w:before="0" w:after="0" w:line="300" w:lineRule="auto"/>
+              <w:ind w:left="0" w:right="0" w:firstLine="0"/>
               <w:jc w:val="center"/>
               <w:rPr/>
             </w:pPr>
             <w:r>
-              <w:rPr/>
+              <w:rPr>
+                <w:color w:val="000000"/>
+                <w:sz w:val="22"/>
+              </w:rPr>
               <w:t>推荐题型</w:t>
             </w:r>
           </w:p>
         </w:tc>
       </w:tr>
       <w:tr>
-        <w:trPr/>
+        <w:trPr>
+          <w:cantSplit/>
+        </w:trPr>
         <w:tc>
           <w:tcPr>
-            <w:tcW w:w="2255" w:type="dxa"/>
-            <w:tcBorders/>
+            <w:tcW w:w="1928" w:type="dxa"/>
             <w:vAlign w:val="center"/>
+            <w:tcBorders>
+              <w:top w:val="single" w:sz="4" w:color="D9D9D9"/>
+              <w:left w:val="single" w:sz="4" w:color="D9D9D9"/>
+              <w:bottom w:val="single" w:sz="4" w:color="D9D9D9"/>
+              <w:right w:val="single" w:sz="4" w:color="D9D9D9"/>
+            </w:tcBorders>
+            <w:tcMar>
+              <w:top w:w="100" w:type="dxa"/>
+              <w:left w:w="100" w:type="dxa"/>
+              <w:bottom w:w="100" w:type="dxa"/>
+              <w:right w:w="100" w:type="dxa"/>
+            </w:tcMar>
           </w:tcPr>
           <w:p>
             <w:pPr>
               <w:pStyle w:val="TableContents"/>
+              <w:keepNext w:val="0"/>
               <w:bidi w:val="0"/>
-              <w:spacing w:before="0" w:after="283"/>
+              <w:spacing w:before="0" w:after="0" w:line="300" w:lineRule="auto"/>
+              <w:ind w:left="0" w:right="0" w:firstLine="0"/>
+              <w:jc w:val="center"/>
               <w:rPr/>
             </w:pPr>
             <w:r>
-              <w:rPr/>
+              <w:rPr>
+                <w:color w:val="000000"/>
+                <w:sz w:val="22"/>
+              </w:rPr>
               <w:t>行为或频率</w:t>
             </w:r>
           </w:p>
         </w:tc>
         <w:tc>
           <w:tcPr>
-            <w:tcW w:w="5181" w:type="dxa"/>
-            <w:tcBorders/>
+            <w:tcW w:w="4195" w:type="dxa"/>
             <w:vAlign w:val="center"/>
+            <w:tcBorders>
+              <w:top w:val="single" w:sz="4" w:color="D9D9D9"/>
+              <w:left w:val="single" w:sz="4" w:color="D9D9D9"/>
+              <w:bottom w:val="single" w:sz="4" w:color="D9D9D9"/>
+              <w:right w:val="single" w:sz="4" w:color="D9D9D9"/>
+            </w:tcBorders>
+            <w:tcMar>
+              <w:top w:w="100" w:type="dxa"/>
+              <w:left w:w="100" w:type="dxa"/>
+              <w:bottom w:w="100" w:type="dxa"/>
+              <w:right w:w="100" w:type="dxa"/>
+            </w:tcMar>
+          </w:tcPr>
+          <w:p>
+            <w:pPr>
+              <w:keepNext w:val="0"/>
+              <w:spacing w:before="0" w:after="0" w:line="300" w:lineRule="auto"/>
+              <w:ind w:left="0" w:right="0" w:firstLine="0"/>
+              <w:jc w:val="left"/>
+            </w:pPr>
+            <w:r>
+              <w:rPr>
+                <w:color w:val="000000"/>
+                <w:sz w:val="22"/>
+              </w:rPr>
+              <w:t>过去 7 天内（含今天），您进行【目标行为】共多少次？</w:t>
+            </w:r>
+          </w:p>
+        </w:tc>
+        <w:tc>
+          <w:tcPr>
+            <w:tcW w:w="3288" w:type="dxa"/>
+            <w:vAlign w:val="center"/>
+            <w:tcBorders>
+              <w:top w:val="single" w:sz="4" w:color="D9D9D9"/>
+              <w:left w:val="single" w:sz="4" w:color="D9D9D9"/>
+              <w:bottom w:val="single" w:sz="4" w:color="D9D9D9"/>
+              <w:right w:val="single" w:sz="4" w:color="D9D9D9"/>
+            </w:tcBorders>
+            <w:tcMar>
+              <w:top w:w="100" w:type="dxa"/>
+              <w:left w:w="100" w:type="dxa"/>
+              <w:bottom w:w="100" w:type="dxa"/>
+              <w:right w:w="100" w:type="dxa"/>
+            </w:tcMar>
+          </w:tcPr>
+          <w:p>
+            <w:pPr>
+              <w:keepNext w:val="0"/>
+              <w:spacing w:before="0" w:after="0" w:line="300" w:lineRule="auto"/>
+              <w:ind w:left="0" w:right="0" w:firstLine="0"/>
+              <w:jc w:val="left"/>
+            </w:pPr>
+            <w:r>
+              <w:rPr>
+                <w:color w:val="000000"/>
+                <w:sz w:val="22"/>
+              </w:rPr>
+              <w:t>单选题：0 次、1-2 次、3-4 次、5 次及以上</w:t>
+            </w:r>
+          </w:p>
+        </w:tc>
+      </w:tr>
+      <w:tr>
+        <w:trPr>
+          <w:cantSplit/>
+        </w:trPr>
+        <w:tc>
+          <w:tcPr>
+            <w:tcW w:w="1928" w:type="dxa"/>
+            <w:vAlign w:val="center"/>
+            <w:tcBorders>
+              <w:top w:val="single" w:sz="4" w:color="D9D9D9"/>
+              <w:left w:val="single" w:sz="4" w:color="D9D9D9"/>
+              <w:bottom w:val="single" w:sz="4" w:color="D9D9D9"/>
+              <w:right w:val="single" w:sz="4" w:color="D9D9D9"/>
+            </w:tcBorders>
+            <w:tcMar>
+              <w:top w:w="100" w:type="dxa"/>
+              <w:left w:w="100" w:type="dxa"/>
+              <w:bottom w:w="100" w:type="dxa"/>
+              <w:right w:w="100" w:type="dxa"/>
+            </w:tcMar>
           </w:tcPr>
           <w:p>
             <w:pPr>
               <w:pStyle w:val="TableContents"/>
+              <w:keepNext w:val="0"/>
               <w:bidi w:val="0"/>
-              <w:spacing w:before="0" w:after="283"/>
+              <w:spacing w:before="0" w:after="0" w:line="300" w:lineRule="auto"/>
+              <w:ind w:left="0" w:right="0" w:firstLine="0"/>
+              <w:jc w:val="center"/>
               <w:rPr/>
             </w:pPr>
             <w:r>
-              <w:rPr/>
-              <w:t xml:space="preserve">过去 </w:t>
-            </w:r>
-            <w:r>
-              <w:rPr/>
-              <w:t xml:space="preserve">30 </w:t>
-            </w:r>
-            <w:r>
-              <w:rPr/>
-              <w:t>天内，您平均每周进行【目标行为】的次数是？</w:t>
+              <w:rPr>
+                <w:color w:val="000000"/>
+                <w:sz w:val="22"/>
+              </w:rPr>
+              <w:t>态度或认同</w:t>
             </w:r>
           </w:p>
         </w:tc>
         <w:tc>
           <w:tcPr>
-            <w:tcW w:w="3903" w:type="dxa"/>
-            <w:tcBorders/>
+            <w:tcW w:w="4195" w:type="dxa"/>
             <w:vAlign w:val="center"/>
+            <w:tcBorders>
+              <w:top w:val="single" w:sz="4" w:color="D9D9D9"/>
+              <w:left w:val="single" w:sz="4" w:color="D9D9D9"/>
+              <w:bottom w:val="single" w:sz="4" w:color="D9D9D9"/>
+              <w:right w:val="single" w:sz="4" w:color="D9D9D9"/>
+            </w:tcBorders>
+            <w:tcMar>
+              <w:top w:w="100" w:type="dxa"/>
+              <w:left w:w="100" w:type="dxa"/>
+              <w:bottom w:w="100" w:type="dxa"/>
+              <w:right w:w="100" w:type="dxa"/>
+            </w:tcMar>
           </w:tcPr>
           <w:p>
             <w:pPr>
               <w:pStyle w:val="TableContents"/>
+              <w:keepNext w:val="0"/>
               <w:bidi w:val="0"/>
-              <w:spacing w:before="0" w:after="283"/>
+              <w:spacing w:before="0" w:after="0" w:line="300" w:lineRule="auto"/>
+              <w:ind w:left="0" w:right="0" w:firstLine="0"/>
+              <w:jc w:val="left"/>
               <w:rPr/>
             </w:pPr>
             <w:r>
+              <w:rPr>
+                <w:color w:val="000000"/>
+                <w:sz w:val="22"/>
+              </w:rPr>
+              <w:t>请评价您对“【中性陈述】”的认同程度。</w:t>
+            </w:r>
+          </w:p>
+        </w:tc>
+        <w:tc>
+          <w:tcPr>
+            <w:tcW w:w="3288" w:type="dxa"/>
+            <w:vAlign w:val="center"/>
+            <w:tcBorders>
+              <w:top w:val="single" w:sz="4" w:color="D9D9D9"/>
+              <w:left w:val="single" w:sz="4" w:color="D9D9D9"/>
+              <w:bottom w:val="single" w:sz="4" w:color="D9D9D9"/>
+              <w:right w:val="single" w:sz="4" w:color="D9D9D9"/>
+            </w:tcBorders>
+            <w:tcMar>
+              <w:top w:w="100" w:type="dxa"/>
+              <w:left w:w="100" w:type="dxa"/>
+              <w:bottom w:w="100" w:type="dxa"/>
+              <w:right w:w="100" w:type="dxa"/>
+            </w:tcMar>
+          </w:tcPr>
+          <w:p>
+            <w:pPr>
+              <w:pStyle w:val="TableContents"/>
+              <w:keepNext w:val="0"/>
+              <w:bidi w:val="0"/>
+              <w:spacing w:before="0" w:after="0" w:line="300" w:lineRule="auto"/>
+              <w:ind w:left="0" w:right="0" w:firstLine="0"/>
+              <w:jc w:val="left"/>
               <w:rPr/>
-              <w:t>单选题，选项互斥且覆盖常见范围</w:t>
+            </w:pPr>
+            <w:r>
+              <w:rPr>
+                <w:color w:val="000000"/>
+                <w:sz w:val="22"/>
+              </w:rPr>
+              <w:t xml:space="preserve">5 </w:t>
+            </w:r>
+            <w:r>
+              <w:rPr>
+                <w:color w:val="000000"/>
+                <w:sz w:val="22"/>
+              </w:rPr>
+              <w:t xml:space="preserve">点或 </w:t>
+            </w:r>
+            <w:r>
+              <w:rPr>
+                <w:color w:val="000000"/>
+                <w:sz w:val="22"/>
+              </w:rPr>
+              <w:t xml:space="preserve">7 </w:t>
+            </w:r>
+            <w:r>
+              <w:rPr>
+                <w:color w:val="000000"/>
+                <w:sz w:val="22"/>
+              </w:rPr>
+              <w:t xml:space="preserve">点 </w:t>
+            </w:r>
+            <w:r>
+              <w:rPr>
+                <w:color w:val="000000"/>
+                <w:sz w:val="22"/>
+              </w:rPr>
+              <w:t xml:space="preserve">Likert </w:t>
+            </w:r>
+            <w:r>
+              <w:rPr>
+                <w:color w:val="000000"/>
+                <w:sz w:val="22"/>
+              </w:rPr>
+              <w:t>型评分题</w:t>
             </w:r>
           </w:p>
         </w:tc>
       </w:tr>
       <w:tr>
-        <w:trPr/>
+        <w:trPr>
+          <w:cantSplit/>
+        </w:trPr>
         <w:tc>
           <w:tcPr>
-            <w:tcW w:w="2255" w:type="dxa"/>
-            <w:tcBorders/>
+            <w:tcW w:w="1928" w:type="dxa"/>
             <w:vAlign w:val="center"/>
+            <w:tcBorders>
+              <w:top w:val="single" w:sz="4" w:color="D9D9D9"/>
+              <w:left w:val="single" w:sz="4" w:color="D9D9D9"/>
+              <w:bottom w:val="single" w:sz="4" w:color="D9D9D9"/>
+              <w:right w:val="single" w:sz="4" w:color="D9D9D9"/>
+            </w:tcBorders>
+            <w:tcMar>
+              <w:top w:w="100" w:type="dxa"/>
+              <w:left w:w="100" w:type="dxa"/>
+              <w:bottom w:w="100" w:type="dxa"/>
+              <w:right w:w="100" w:type="dxa"/>
+            </w:tcMar>
           </w:tcPr>
           <w:p>
             <w:pPr>
               <w:pStyle w:val="TableContents"/>
+              <w:keepNext w:val="0"/>
               <w:bidi w:val="0"/>
-              <w:spacing w:before="0" w:after="283"/>
+              <w:spacing w:before="0" w:after="0" w:line="300" w:lineRule="auto"/>
+              <w:ind w:left="0" w:right="0" w:firstLine="0"/>
+              <w:jc w:val="center"/>
               <w:rPr/>
             </w:pPr>
             <w:r>
-              <w:rPr/>
-              <w:t>态度或认同</w:t>
+              <w:rPr>
+                <w:color w:val="000000"/>
+                <w:sz w:val="22"/>
+              </w:rPr>
+              <w:t>满意度</w:t>
             </w:r>
           </w:p>
         </w:tc>
         <w:tc>
           <w:tcPr>
-            <w:tcW w:w="5181" w:type="dxa"/>
-            <w:tcBorders/>
+            <w:tcW w:w="4195" w:type="dxa"/>
             <w:vAlign w:val="center"/>
+            <w:tcBorders>
+              <w:top w:val="single" w:sz="4" w:color="D9D9D9"/>
+              <w:left w:val="single" w:sz="4" w:color="D9D9D9"/>
+              <w:bottom w:val="single" w:sz="4" w:color="D9D9D9"/>
+              <w:right w:val="single" w:sz="4" w:color="D9D9D9"/>
+            </w:tcBorders>
+            <w:tcMar>
+              <w:top w:w="100" w:type="dxa"/>
+              <w:left w:w="100" w:type="dxa"/>
+              <w:bottom w:w="100" w:type="dxa"/>
+              <w:right w:w="100" w:type="dxa"/>
+            </w:tcMar>
           </w:tcPr>
           <w:p>
             <w:pPr>
               <w:pStyle w:val="TableContents"/>
+              <w:keepNext w:val="0"/>
               <w:bidi w:val="0"/>
-              <w:spacing w:before="0" w:after="283"/>
+              <w:spacing w:before="0" w:after="0" w:line="300" w:lineRule="auto"/>
+              <w:ind w:left="0" w:right="0" w:firstLine="0"/>
+              <w:jc w:val="left"/>
               <w:rPr/>
             </w:pPr>
             <w:r>
-              <w:rPr/>
-              <w:t>请评价您对“【中性陈述】”的认同程度。</w:t>
+              <w:rPr>
+                <w:color w:val="000000"/>
+                <w:sz w:val="22"/>
+              </w:rPr>
+              <w:t>您对【服务</w:t>
+            </w:r>
+            <w:r>
+              <w:rPr>
+                <w:color w:val="000000"/>
+                <w:sz w:val="22"/>
+              </w:rPr>
+              <w:t>/</w:t>
+            </w:r>
+            <w:r>
+              <w:rPr>
+                <w:color w:val="000000"/>
+                <w:sz w:val="22"/>
+              </w:rPr>
+              <w:t>体验】的总体满意程度如何？</w:t>
             </w:r>
           </w:p>
         </w:tc>
         <w:tc>
           <w:tcPr>
-            <w:tcW w:w="3903" w:type="dxa"/>
-            <w:tcBorders/>
+            <w:tcW w:w="3288" w:type="dxa"/>
             <w:vAlign w:val="center"/>
+            <w:tcBorders>
+              <w:top w:val="single" w:sz="4" w:color="D9D9D9"/>
+              <w:left w:val="single" w:sz="4" w:color="D9D9D9"/>
+              <w:bottom w:val="single" w:sz="4" w:color="D9D9D9"/>
+              <w:right w:val="single" w:sz="4" w:color="D9D9D9"/>
+            </w:tcBorders>
+            <w:tcMar>
+              <w:top w:w="100" w:type="dxa"/>
+              <w:left w:w="100" w:type="dxa"/>
+              <w:bottom w:w="100" w:type="dxa"/>
+              <w:right w:w="100" w:type="dxa"/>
+            </w:tcMar>
           </w:tcPr>
           <w:p>
             <w:pPr>
               <w:pStyle w:val="TableContents"/>
+              <w:keepNext w:val="0"/>
               <w:bidi w:val="0"/>
-              <w:spacing w:before="0" w:after="283"/>
+              <w:spacing w:before="0" w:after="0" w:line="300" w:lineRule="auto"/>
+              <w:ind w:left="0" w:right="0" w:firstLine="0"/>
+              <w:jc w:val="left"/>
               <w:rPr/>
             </w:pPr>
             <w:r>
-              <w:rPr/>
+              <w:rPr>
+                <w:color w:val="000000"/>
+                <w:sz w:val="22"/>
+              </w:rPr>
               <w:t xml:space="preserve">5 </w:t>
             </w:r>
             <w:r>
-              <w:rPr/>
+              <w:rPr>
+                <w:color w:val="000000"/>
+                <w:sz w:val="22"/>
+              </w:rPr>
               <w:t xml:space="preserve">点或 </w:t>
             </w:r>
             <w:r>
-              <w:rPr/>
+              <w:rPr>
+                <w:color w:val="000000"/>
+                <w:sz w:val="22"/>
+              </w:rPr>
               <w:t xml:space="preserve">7 </w:t>
             </w:r>
             <w:r>
-              <w:rPr/>
-              <w:t xml:space="preserve">点 </w:t>
-            </w:r>
-            <w:r>
-              <w:rPr/>
-              <w:t xml:space="preserve">Likert </w:t>
-            </w:r>
-            <w:r>
-              <w:rPr/>
-              <w:t>型评分题</w:t>
+              <w:rPr>
+                <w:color w:val="000000"/>
+                <w:sz w:val="22"/>
+              </w:rPr>
+              <w:t>点评分题</w:t>
             </w:r>
           </w:p>
         </w:tc>
       </w:tr>
       <w:tr>
-        <w:trPr/>
+        <w:trPr>
+          <w:cantSplit/>
+        </w:trPr>
         <w:tc>
           <w:tcPr>
-            <w:tcW w:w="2255" w:type="dxa"/>
-            <w:tcBorders/>
+            <w:tcW w:w="1928" w:type="dxa"/>
             <w:vAlign w:val="center"/>
+            <w:tcBorders>
+              <w:top w:val="single" w:sz="4" w:color="D9D9D9"/>
+              <w:left w:val="single" w:sz="4" w:color="D9D9D9"/>
+              <w:bottom w:val="single" w:sz="4" w:color="D9D9D9"/>
+              <w:right w:val="single" w:sz="4" w:color="D9D9D9"/>
+            </w:tcBorders>
+            <w:tcMar>
+              <w:top w:w="100" w:type="dxa"/>
+              <w:left w:w="100" w:type="dxa"/>
+              <w:bottom w:w="100" w:type="dxa"/>
+              <w:right w:w="100" w:type="dxa"/>
+            </w:tcMar>
           </w:tcPr>
           <w:p>
             <w:pPr>
               <w:pStyle w:val="TableContents"/>
+              <w:keepNext w:val="0"/>
               <w:bidi w:val="0"/>
-              <w:spacing w:before="0" w:after="283"/>
+              <w:spacing w:before="0" w:after="0" w:line="300" w:lineRule="auto"/>
+              <w:ind w:left="0" w:right="0" w:firstLine="0"/>
+              <w:jc w:val="center"/>
               <w:rPr/>
             </w:pPr>
             <w:r>
-              <w:rPr/>
-              <w:t>满意度</w:t>
+              <w:rPr>
+                <w:color w:val="000000"/>
+                <w:sz w:val="22"/>
+              </w:rPr>
+              <w:t>原因或需求</w:t>
             </w:r>
           </w:p>
         </w:tc>
         <w:tc>
           <w:tcPr>
-            <w:tcW w:w="5181" w:type="dxa"/>
-            <w:tcBorders/>
+            <w:tcW w:w="4195" w:type="dxa"/>
             <w:vAlign w:val="center"/>
+            <w:tcBorders>
+              <w:top w:val="single" w:sz="4" w:color="D9D9D9"/>
+              <w:left w:val="single" w:sz="4" w:color="D9D9D9"/>
+              <w:bottom w:val="single" w:sz="4" w:color="D9D9D9"/>
+              <w:right w:val="single" w:sz="4" w:color="D9D9D9"/>
+            </w:tcBorders>
+            <w:tcMar>
+              <w:top w:w="100" w:type="dxa"/>
+              <w:left w:w="100" w:type="dxa"/>
+              <w:bottom w:w="100" w:type="dxa"/>
+              <w:right w:w="100" w:type="dxa"/>
+            </w:tcMar>
           </w:tcPr>
           <w:p>
             <w:pPr>
               <w:pStyle w:val="TableContents"/>
+              <w:keepNext w:val="0"/>
               <w:bidi w:val="0"/>
-              <w:spacing w:before="0" w:after="283"/>
+              <w:spacing w:before="0" w:after="0" w:line="300" w:lineRule="auto"/>
+              <w:ind w:left="0" w:right="0" w:firstLine="0"/>
+              <w:jc w:val="left"/>
               <w:rPr/>
             </w:pPr>
             <w:r>
-              <w:rPr/>
-              <w:t>您对【服务</w:t>
-            </w:r>
-            <w:r>
-              <w:rPr/>
+              <w:rPr>
+                <w:color w:val="000000"/>
+                <w:sz w:val="22"/>
+              </w:rPr>
+              <w:t>哪些因素会影响您【行为</w:t>
+            </w:r>
+            <w:r>
+              <w:rPr>
+                <w:color w:val="000000"/>
+                <w:sz w:val="22"/>
+              </w:rPr>
               <w:t>/</w:t>
             </w:r>
             <w:r>
-              <w:rPr/>
-              <w:t>体验】的总体满意程度如何？</w:t>
+              <w:rPr>
+                <w:color w:val="000000"/>
+                <w:sz w:val="22"/>
+              </w:rPr>
+              <w:t>选择】？</w:t>
             </w:r>
           </w:p>
         </w:tc>
         <w:tc>
           <w:tcPr>
-            <w:tcW w:w="3903" w:type="dxa"/>
-            <w:tcBorders/>
+            <w:tcW w:w="3288" w:type="dxa"/>
             <w:vAlign w:val="center"/>
+            <w:tcBorders>
+              <w:top w:val="single" w:sz="4" w:color="D9D9D9"/>
+              <w:left w:val="single" w:sz="4" w:color="D9D9D9"/>
+              <w:bottom w:val="single" w:sz="4" w:color="D9D9D9"/>
+              <w:right w:val="single" w:sz="4" w:color="D9D9D9"/>
+            </w:tcBorders>
+            <w:tcMar>
+              <w:top w:w="100" w:type="dxa"/>
+              <w:left w:w="100" w:type="dxa"/>
+              <w:bottom w:w="100" w:type="dxa"/>
+              <w:right w:w="100" w:type="dxa"/>
+            </w:tcMar>
           </w:tcPr>
           <w:p>
             <w:pPr>
               <w:pStyle w:val="TableContents"/>
+              <w:keepNext w:val="0"/>
               <w:bidi w:val="0"/>
-              <w:spacing w:before="0" w:after="283"/>
+              <w:spacing w:before="0" w:after="0" w:line="300" w:lineRule="auto"/>
+              <w:ind w:left="0" w:right="0" w:firstLine="0"/>
+              <w:jc w:val="left"/>
               <w:rPr/>
             </w:pPr>
             <w:r>
-              <w:rPr/>
-              <w:t xml:space="preserve">5 </w:t>
-            </w:r>
-            <w:r>
-              <w:rPr/>
-              <w:t xml:space="preserve">点或 </w:t>
-            </w:r>
-            <w:r>
-              <w:rPr/>
-              <w:t xml:space="preserve">7 </w:t>
-            </w:r>
-            <w:r>
-              <w:rPr/>
-              <w:t>点评分题</w:t>
+              <w:rPr>
+                <w:color w:val="000000"/>
+                <w:sz w:val="22"/>
+              </w:rPr>
+              <w:t>多选题，并明确最少</w:t>
+            </w:r>
+            <w:r>
+              <w:rPr>
+                <w:color w:val="000000"/>
+                <w:sz w:val="22"/>
+              </w:rPr>
+              <w:t>/</w:t>
+            </w:r>
+            <w:r>
+              <w:rPr>
+                <w:color w:val="000000"/>
+                <w:sz w:val="22"/>
+              </w:rPr>
+              <w:t>最多选择数</w:t>
             </w:r>
           </w:p>
         </w:tc>
       </w:tr>
       <w:tr>
-        <w:trPr/>
+        <w:trPr>
+          <w:cantSplit/>
+        </w:trPr>
         <w:tc>
           <w:tcPr>
-            <w:tcW w:w="2255" w:type="dxa"/>
-            <w:tcBorders/>
+            <w:tcW w:w="1928" w:type="dxa"/>
             <w:vAlign w:val="center"/>
+            <w:tcBorders>
+              <w:top w:val="single" w:sz="4" w:color="D9D9D9"/>
+              <w:left w:val="single" w:sz="4" w:color="D9D9D9"/>
+              <w:bottom w:val="single" w:sz="4" w:color="D9D9D9"/>
+              <w:right w:val="single" w:sz="4" w:color="D9D9D9"/>
+            </w:tcBorders>
+            <w:tcMar>
+              <w:top w:w="100" w:type="dxa"/>
+              <w:left w:w="100" w:type="dxa"/>
+              <w:bottom w:w="100" w:type="dxa"/>
+              <w:right w:w="100" w:type="dxa"/>
+            </w:tcMar>
           </w:tcPr>
           <w:p>
             <w:pPr>
               <w:pStyle w:val="TableContents"/>
+              <w:keepNext w:val="0"/>
               <w:bidi w:val="0"/>
-              <w:spacing w:before="0" w:after="283"/>
+              <w:spacing w:before="0" w:after="0" w:line="300" w:lineRule="auto"/>
+              <w:ind w:left="0" w:right="0" w:firstLine="0"/>
+              <w:jc w:val="center"/>
               <w:rPr/>
             </w:pPr>
             <w:r>
-              <w:rPr/>
-              <w:t>原因或需求</w:t>
+              <w:rPr>
+                <w:color w:val="000000"/>
+                <w:sz w:val="22"/>
+              </w:rPr>
+              <w:t>事实判断</w:t>
             </w:r>
           </w:p>
         </w:tc>
         <w:tc>
           <w:tcPr>
-            <w:tcW w:w="5181" w:type="dxa"/>
-            <w:tcBorders/>
+            <w:tcW w:w="4195" w:type="dxa"/>
             <w:vAlign w:val="center"/>
+            <w:tcBorders>
+              <w:top w:val="single" w:sz="4" w:color="D9D9D9"/>
+              <w:left w:val="single" w:sz="4" w:color="D9D9D9"/>
+              <w:bottom w:val="single" w:sz="4" w:color="D9D9D9"/>
+              <w:right w:val="single" w:sz="4" w:color="D9D9D9"/>
+            </w:tcBorders>
+            <w:tcMar>
+              <w:top w:w="100" w:type="dxa"/>
+              <w:left w:w="100" w:type="dxa"/>
+              <w:bottom w:w="100" w:type="dxa"/>
+              <w:right w:w="100" w:type="dxa"/>
+            </w:tcMar>
           </w:tcPr>
           <w:p>
             <w:pPr>
               <w:pStyle w:val="TableContents"/>
+              <w:keepNext w:val="0"/>
               <w:bidi w:val="0"/>
-              <w:spacing w:before="0" w:after="283"/>
+              <w:spacing w:before="0" w:after="0" w:line="300" w:lineRule="auto"/>
+              <w:ind w:left="0" w:right="0" w:firstLine="0"/>
+              <w:jc w:val="left"/>
               <w:rPr/>
             </w:pPr>
             <w:r>
-              <w:rPr/>
-              <w:t>哪些因素会影响您【行为</w:t>
-            </w:r>
-            <w:r>
-              <w:rPr/>
+              <w:rPr>
+                <w:color w:val="000000"/>
+                <w:sz w:val="22"/>
+              </w:rPr>
+              <w:t>您是否使用过【功能</w:t>
+            </w:r>
+            <w:r>
+              <w:rPr>
+                <w:color w:val="000000"/>
+                <w:sz w:val="22"/>
+              </w:rPr>
               <w:t>/</w:t>
             </w:r>
             <w:r>
-              <w:rPr/>
-              <w:t>选择】？</w:t>
+              <w:rPr>
+                <w:color w:val="000000"/>
+                <w:sz w:val="22"/>
+              </w:rPr>
+              <w:t>服务】？</w:t>
             </w:r>
           </w:p>
         </w:tc>
         <w:tc>
           <w:tcPr>
-            <w:tcW w:w="3903" w:type="dxa"/>
-            <w:tcBorders/>
+            <w:tcW w:w="3288" w:type="dxa"/>
             <w:vAlign w:val="center"/>
+            <w:tcBorders>
+              <w:top w:val="single" w:sz="4" w:color="D9D9D9"/>
+              <w:left w:val="single" w:sz="4" w:color="D9D9D9"/>
+              <w:bottom w:val="single" w:sz="4" w:color="D9D9D9"/>
+              <w:right w:val="single" w:sz="4" w:color="D9D9D9"/>
+            </w:tcBorders>
+            <w:tcMar>
+              <w:top w:w="100" w:type="dxa"/>
+              <w:left w:w="100" w:type="dxa"/>
+              <w:bottom w:w="100" w:type="dxa"/>
+              <w:right w:w="100" w:type="dxa"/>
+            </w:tcMar>
           </w:tcPr>
           <w:p>
             <w:pPr>
               <w:pStyle w:val="TableContents"/>
+              <w:keepNext w:val="0"/>
               <w:bidi w:val="0"/>
-              <w:spacing w:before="0" w:after="283"/>
+              <w:spacing w:before="0" w:after="0" w:line="300" w:lineRule="auto"/>
+              <w:ind w:left="0" w:right="0" w:firstLine="0"/>
+              <w:jc w:val="left"/>
               <w:rPr/>
             </w:pPr>
             <w:r>
-              <w:rPr/>
-              <w:t>多选题，并明确最少</w:t>
-            </w:r>
-            <w:r>
-              <w:rPr/>
+              <w:rPr>
+                <w:color w:val="000000"/>
+                <w:sz w:val="22"/>
+              </w:rPr>
+              <w:t>是</w:t>
+            </w:r>
+            <w:r>
+              <w:rPr>
+                <w:color w:val="000000"/>
+                <w:sz w:val="22"/>
+              </w:rPr>
               <w:t>/</w:t>
             </w:r>
             <w:r>
-              <w:rPr/>
-              <w:t>最多选择数</w:t>
-            </w:r>
-          </w:p>
-        </w:tc>
-      </w:tr>
-      <w:tr>
-        <w:trPr/>
-        <w:tc>
-          <w:tcPr>
-            <w:tcW w:w="2255" w:type="dxa"/>
-            <w:tcBorders/>
-            <w:vAlign w:val="center"/>
-          </w:tcPr>
-          <w:p>
-            <w:pPr>
-              <w:pStyle w:val="TableContents"/>
-              <w:bidi w:val="0"/>
-              <w:spacing w:before="0" w:after="283"/>
-              <w:rPr/>
-            </w:pPr>
-            <w:r>
-              <w:rPr/>
-              <w:t>事实判断</w:t>
-            </w:r>
-          </w:p>
-        </w:tc>
-        <w:tc>
-          <w:tcPr>
-            <w:tcW w:w="5181" w:type="dxa"/>
-            <w:tcBorders/>
-            <w:vAlign w:val="center"/>
-          </w:tcPr>
-          <w:p>
-            <w:pPr>
-              <w:pStyle w:val="TableContents"/>
-              <w:bidi w:val="0"/>
-              <w:spacing w:before="0" w:after="283"/>
-              <w:rPr/>
-            </w:pPr>
-            <w:r>
-              <w:rPr/>
-              <w:t>您是否使用过【功能</w:t>
-            </w:r>
-            <w:r>
-              <w:rPr/>
-              <w:t>/</w:t>
-            </w:r>
-            <w:r>
-              <w:rPr/>
-              <w:t>服务】？</w:t>
-            </w:r>
-          </w:p>
-        </w:tc>
-        <w:tc>
-          <w:tcPr>
-            <w:tcW w:w="3903" w:type="dxa"/>
-            <w:tcBorders/>
-            <w:vAlign w:val="center"/>
-          </w:tcPr>
-          <w:p>
-            <w:pPr>
-              <w:pStyle w:val="TableContents"/>
-              <w:bidi w:val="0"/>
-              <w:spacing w:before="0" w:after="283"/>
-              <w:rPr/>
-            </w:pPr>
-            <w:r>
-              <w:rPr/>
-              <w:t>是</w:t>
-            </w:r>
-            <w:r>
-              <w:rPr/>
-              <w:t>/</w:t>
-            </w:r>
-            <w:r>
-              <w:rPr/>
+              <w:rPr>
+                <w:color w:val="000000"/>
+                <w:sz w:val="22"/>
+              </w:rPr>
               <w:t>否题</w:t>
             </w:r>
           </w:p>
@@ -749,11 +1171,17 @@
     <w:p>
       <w:pPr>
         <w:pStyle w:val="Heading3"/>
-        <w:bidi w:val="0"/>
-        <w:rPr/>
-      </w:pPr>
-      <w:r>
-        <w:rPr/>
+        <w:keepNext/>
+        <w:bidi w:val="0"/>
+        <w:spacing w:after="120" w:before="200"/>
+        <w:ind w:left="0" w:right="0"/>
+        <w:rPr/>
+      </w:pPr>
+      <w:r>
+        <w:rPr>
+          <w:color w:val="000000"/>
+          <w:sz w:val="24"/>
+        </w:rPr>
         <w:t>量表建议</w:t>
       </w:r>
     </w:p>
@@ -769,36 +1197,50 @@
           <w:tab w:val="left" w:pos="1956" w:leader="none"/>
         </w:tabs>
         <w:bidi w:val="0"/>
-        <w:spacing w:before="0" w:after="0"/>
-        <w:ind w:hanging="283" w:start="1956"/>
-        <w:rPr/>
-      </w:pPr>
-      <w:r>
-        <w:rPr/>
+        <w:spacing w:before="0" w:after="120"/>
+        <w:ind w:hanging="283" w:start="1956" w:left="0" w:right="0"/>
+        <w:rPr/>
+      </w:pPr>
+      <w:r>
+        <w:rPr>
+          <w:color w:val="000000"/>
+        </w:rPr>
         <w:t xml:space="preserve">典型 </w:t>
       </w:r>
       <w:r>
-        <w:rPr/>
+        <w:rPr>
+          <w:color w:val="000000"/>
+        </w:rPr>
         <w:t xml:space="preserve">Likert </w:t>
       </w:r>
       <w:r>
-        <w:rPr/>
+        <w:rPr>
+          <w:color w:val="000000"/>
+        </w:rPr>
         <w:t xml:space="preserve">型题项优先使用 </w:t>
       </w:r>
       <w:r>
-        <w:rPr/>
+        <w:rPr>
+          <w:color w:val="000000"/>
+        </w:rPr>
         <w:t xml:space="preserve">5 </w:t>
       </w:r>
       <w:r>
-        <w:rPr/>
+        <w:rPr>
+          <w:color w:val="000000"/>
+        </w:rPr>
         <w:t xml:space="preserve">点或 </w:t>
       </w:r>
       <w:r>
-        <w:rPr/>
+        <w:rPr>
+          <w:color w:val="000000"/>
+        </w:rPr>
         <w:t xml:space="preserve">7 </w:t>
       </w:r>
       <w:r>
-        <w:rPr/>
+        <w:rPr>
+          <w:color w:val="000000"/>
+        </w:rPr>
         <w:t xml:space="preserve">点奇数选项，并为两端提供含义清楚、方向一致的标签。 </w:t>
       </w:r>
     </w:p>
@@ -814,24 +1256,32 @@
           <w:tab w:val="left" w:pos="1956" w:leader="none"/>
         </w:tabs>
         <w:bidi w:val="0"/>
-        <w:spacing w:before="0" w:after="0"/>
-        <w:ind w:hanging="283" w:start="1956"/>
-        <w:rPr/>
-      </w:pPr>
-      <w:r>
-        <w:rPr/>
+        <w:spacing w:before="0" w:after="120"/>
+        <w:ind w:hanging="283" w:start="1956" w:left="0" w:right="0"/>
+        <w:rPr/>
+      </w:pPr>
+      <w:r>
+        <w:rPr>
+          <w:color w:val="000000"/>
+        </w:rPr>
         <w:t xml:space="preserve">10 </w:t>
       </w:r>
       <w:r>
-        <w:rPr/>
+        <w:rPr>
+          <w:color w:val="000000"/>
+        </w:rPr>
         <w:t xml:space="preserve">点一般评分可以用于满意度或推荐意愿，但不应直接称为 </w:t>
       </w:r>
       <w:r>
-        <w:rPr/>
+        <w:rPr>
+          <w:color w:val="000000"/>
+        </w:rPr>
         <w:t xml:space="preserve">Likert </w:t>
       </w:r>
       <w:r>
-        <w:rPr/>
+        <w:rPr>
+          <w:color w:val="000000"/>
+        </w:rPr>
         <w:t xml:space="preserve">型题项。 </w:t>
       </w:r>
     </w:p>
@@ -847,30 +1297,43 @@
           <w:tab w:val="left" w:pos="1956" w:leader="none"/>
         </w:tabs>
         <w:bidi w:val="0"/>
-        <w:ind w:hanging="283" w:start="1956"/>
-        <w:rPr/>
-      </w:pPr>
-      <w:r>
-        <w:rPr/>
+        <w:spacing w:after="120"/>
+        <w:ind w:hanging="283" w:start="1956" w:left="0" w:right="0"/>
+        <w:rPr/>
+      </w:pPr>
+      <w:r>
+        <w:rPr>
+          <w:color w:val="000000"/>
+        </w:rPr>
         <w:t xml:space="preserve">量表选项不超过 </w:t>
       </w:r>
       <w:r>
-        <w:rPr/>
+        <w:rPr>
+          <w:color w:val="000000"/>
+        </w:rPr>
         <w:t xml:space="preserve">10 </w:t>
       </w:r>
       <w:r>
-        <w:rPr/>
+        <w:rPr>
+          <w:color w:val="000000"/>
+        </w:rPr>
         <w:t xml:space="preserve">个；同一组题目保持方向和刻度一致，避免正反方向无提示切换。 </w:t>
       </w:r>
     </w:p>
     <w:p>
       <w:pPr>
         <w:pStyle w:val="Heading2"/>
-        <w:bidi w:val="0"/>
-        <w:rPr/>
-      </w:pPr>
-      <w:r>
-        <w:rPr/>
+        <w:keepNext/>
+        <w:bidi w:val="0"/>
+        <w:spacing w:after="120" w:before="200"/>
+        <w:ind w:left="0" w:right="0"/>
+        <w:rPr/>
+      </w:pPr>
+      <w:r>
+        <w:rPr>
+          <w:color w:val="000000"/>
+          <w:sz w:val="28"/>
+        </w:rPr>
         <w:t>四、背景资料</w:t>
       </w:r>
     </w:p>
@@ -878,18 +1341,26 @@
       <w:pPr>
         <w:pStyle w:val="BodyText"/>
         <w:bidi w:val="0"/>
-        <w:rPr/>
-      </w:pPr>
-      <w:r>
-        <w:rPr/>
+        <w:spacing w:after="120"/>
+        <w:ind w:left="0" w:right="0"/>
+        <w:rPr/>
+      </w:pPr>
+      <w:r>
+        <w:rPr>
+          <w:color w:val="000000"/>
+        </w:rPr>
         <w:t>只收集分析确实需要的背景变量，选项应互斥、穷尽，并提供“其他</w:t>
       </w:r>
       <w:r>
-        <w:rPr/>
+        <w:rPr>
+          <w:color w:val="000000"/>
+        </w:rPr>
         <w:t>/</w:t>
       </w:r>
       <w:r>
-        <w:rPr/>
+        <w:rPr>
+          <w:color w:val="000000"/>
+        </w:rPr>
         <w:t>不便回答”等合理出口。</w:t>
       </w:r>
     </w:p>
@@ -905,46 +1376,50 @@
           <w:tab w:val="left" w:pos="709" w:leader="none"/>
         </w:tabs>
         <w:bidi w:val="0"/>
-        <w:spacing w:before="0" w:after="0"/>
-        <w:ind w:hanging="283" w:start="709" w:end="0"/>
-        <w:rPr/>
-      </w:pPr>
-      <w:r>
-        <w:rPr/>
+        <w:spacing w:before="0" w:after="120"/>
+        <w:ind w:hanging="283" w:start="709" w:end="0" w:left="0" w:right="0"/>
+        <w:rPr/>
+      </w:pPr>
+      <w:r>
+        <w:rPr>
+          <w:color w:val="000000"/>
+        </w:rPr>
         <w:t>您的</w:t>
       </w:r>
       <w:r>
         <w:rPr>
-          <w:color w:val="4F657D"/>
+          <w:color w:val="000000"/>
         </w:rPr>
         <w:t>【与研究相关的分组变量，如年级</w:t>
       </w:r>
       <w:r>
         <w:rPr>
-          <w:color w:val="4F657D"/>
+          <w:color w:val="000000"/>
         </w:rPr>
         <w:t>/</w:t>
       </w:r>
       <w:r>
         <w:rPr>
-          <w:color w:val="4F657D"/>
+          <w:color w:val="000000"/>
         </w:rPr>
         <w:t>地区</w:t>
       </w:r>
       <w:r>
         <w:rPr>
-          <w:color w:val="4F657D"/>
+          <w:color w:val="000000"/>
         </w:rPr>
         <w:t>/</w:t>
       </w:r>
       <w:r>
         <w:rPr>
-          <w:color w:val="4F657D"/>
+          <w:color w:val="000000"/>
         </w:rPr>
         <w:t>岗位类型】</w:t>
       </w:r>
       <w:r>
-        <w:rPr/>
+        <w:rPr>
+          <w:color w:val="000000"/>
+        </w:rPr>
         <w:t xml:space="preserve">是？ </w:t>
       </w:r>
     </w:p>
@@ -960,21 +1435,26 @@
           <w:tab w:val="left" w:pos="709" w:leader="none"/>
         </w:tabs>
         <w:bidi w:val="0"/>
-        <w:ind w:hanging="283" w:start="709" w:end="0"/>
-        <w:rPr/>
-      </w:pPr>
-      <w:r>
-        <w:rPr/>
+        <w:spacing w:after="120"/>
+        <w:ind w:hanging="283" w:start="709" w:end="0" w:left="0" w:right="0"/>
+        <w:rPr/>
+      </w:pPr>
+      <w:r>
+        <w:rPr>
+          <w:color w:val="000000"/>
+        </w:rPr>
         <w:t>您的</w:t>
       </w:r>
       <w:r>
         <w:rPr>
-          <w:color w:val="4F657D"/>
+          <w:color w:val="000000"/>
         </w:rPr>
         <w:t>【第二个必要背景变量】</w:t>
       </w:r>
       <w:r>
-        <w:rPr/>
+        <w:rPr>
+          <w:color w:val="000000"/>
+        </w:rPr>
         <w:t xml:space="preserve">是？ </w:t>
       </w:r>
     </w:p>
@@ -982,21 +1462,31 @@
       <w:pPr>
         <w:pStyle w:val="BodyTextnote"/>
         <w:bidi w:val="0"/>
-        <w:rPr/>
-      </w:pPr>
-      <w:r>
-        <w:rPr/>
+        <w:spacing w:after="120"/>
+        <w:ind w:left="0" w:right="0"/>
+        <w:rPr/>
+      </w:pPr>
+      <w:r>
+        <w:rPr>
+          <w:color w:val="000000"/>
+        </w:rPr>
         <w:t>不要在课堂共享的问卷或总体数据中收集真实姓名、手机号、证件号、精确住址等非必要敏感信息。</w:t>
       </w:r>
     </w:p>
     <w:p>
       <w:pPr>
         <w:pStyle w:val="Heading2"/>
-        <w:bidi w:val="0"/>
-        <w:rPr/>
-      </w:pPr>
-      <w:r>
-        <w:rPr/>
+        <w:keepNext/>
+        <w:bidi w:val="0"/>
+        <w:spacing w:after="120" w:before="200"/>
+        <w:ind w:left="0" w:right="0"/>
+        <w:rPr/>
+      </w:pPr>
+      <w:r>
+        <w:rPr>
+          <w:color w:val="000000"/>
+          <w:sz w:val="28"/>
+        </w:rPr>
         <w:t>五、结束语</w:t>
       </w:r>
     </w:p>
@@ -1004,42 +1494,55 @@
       <w:pPr>
         <w:pStyle w:val="BodyText"/>
         <w:bidi w:val="0"/>
-        <w:ind w:hanging="0" w:start="0" w:end="0"/>
-        <w:rPr/>
-      </w:pPr>
-      <w:r>
-        <w:rPr/>
+        <w:spacing w:after="120"/>
+        <w:ind w:hanging="0" w:start="0" w:end="0" w:left="0" w:right="0"/>
+        <w:rPr/>
+      </w:pPr>
+      <w:r>
+        <w:rPr>
+          <w:color w:val="000000"/>
+        </w:rPr>
         <w:t>感谢您的参与！您的反馈将帮助我们改进</w:t>
       </w:r>
       <w:r>
         <w:rPr>
-          <w:color w:val="4F657D"/>
+          <w:color w:val="000000"/>
         </w:rPr>
         <w:t>【研究或教学目标】</w:t>
       </w:r>
       <w:r>
-        <w:rPr/>
+        <w:rPr>
+          <w:color w:val="000000"/>
+        </w:rPr>
         <w:t>。如对调查有疑问，请联系</w:t>
       </w:r>
       <w:r>
         <w:rPr>
-          <w:color w:val="4F657D"/>
+          <w:color w:val="000000"/>
         </w:rPr>
         <w:t>【课程教师或项目联系人】</w:t>
       </w:r>
       <w:r>
-        <w:rPr/>
+        <w:rPr>
+          <w:color w:val="000000"/>
+        </w:rPr>
         <w:t>。</w:t>
       </w:r>
     </w:p>
     <w:p>
       <w:pPr>
         <w:pStyle w:val="Heading2"/>
-        <w:bidi w:val="0"/>
-        <w:rPr/>
-      </w:pPr>
-      <w:r>
-        <w:rPr/>
+        <w:keepNext/>
+        <w:bidi w:val="0"/>
+        <w:spacing w:after="120" w:before="200"/>
+        <w:ind w:left="0" w:right="0"/>
+        <w:rPr/>
+      </w:pPr>
+      <w:r>
+        <w:rPr>
+          <w:color w:val="000000"/>
+          <w:sz w:val="28"/>
+        </w:rPr>
         <w:t>六、发布前检查表</w:t>
       </w:r>
     </w:p>
@@ -1055,12 +1558,14 @@
           <w:tab w:val="left" w:pos="1956" w:leader="none"/>
         </w:tabs>
         <w:bidi w:val="0"/>
-        <w:spacing w:before="0" w:after="0"/>
-        <w:ind w:hanging="283" w:start="1956"/>
-        <w:rPr/>
-      </w:pPr>
-      <w:r>
-        <w:rPr/>
+        <w:spacing w:before="0" w:after="120"/>
+        <w:ind w:hanging="283" w:start="1956" w:left="0" w:right="0"/>
+        <w:rPr/>
+      </w:pPr>
+      <w:r>
+        <w:rPr>
+          <w:color w:val="000000"/>
+        </w:rPr>
         <w:t xml:space="preserve">研究目的、目标总体和分析单位是否一致？ </w:t>
       </w:r>
     </w:p>
@@ -1076,12 +1581,14 @@
           <w:tab w:val="left" w:pos="1956" w:leader="none"/>
         </w:tabs>
         <w:bidi w:val="0"/>
-        <w:spacing w:before="0" w:after="0"/>
-        <w:ind w:hanging="283" w:start="1956"/>
-        <w:rPr/>
-      </w:pPr>
-      <w:r>
-        <w:rPr/>
+        <w:spacing w:before="0" w:after="120"/>
+        <w:ind w:hanging="283" w:start="1956" w:left="0" w:right="0"/>
+        <w:rPr/>
+      </w:pPr>
+      <w:r>
+        <w:rPr>
+          <w:color w:val="000000"/>
+        </w:rPr>
         <w:t xml:space="preserve">每道题是否只测量一个概念，并给出必要的时间范围？ </w:t>
       </w:r>
     </w:p>
@@ -1097,12 +1604,14 @@
           <w:tab w:val="left" w:pos="1956" w:leader="none"/>
         </w:tabs>
         <w:bidi w:val="0"/>
-        <w:spacing w:before="0" w:after="0"/>
-        <w:ind w:hanging="283" w:start="1956"/>
-        <w:rPr/>
-      </w:pPr>
-      <w:r>
-        <w:rPr/>
+        <w:spacing w:before="0" w:after="120"/>
+        <w:ind w:hanging="283" w:start="1956" w:left="0" w:right="0"/>
+        <w:rPr/>
+      </w:pPr>
+      <w:r>
+        <w:rPr>
+          <w:color w:val="000000"/>
+        </w:rPr>
         <w:t xml:space="preserve">题干是否中性，是否避免暗示“正确答案”和双重否定？ </w:t>
       </w:r>
     </w:p>
@@ -1118,12 +1627,14 @@
           <w:tab w:val="left" w:pos="1956" w:leader="none"/>
         </w:tabs>
         <w:bidi w:val="0"/>
-        <w:spacing w:before="0" w:after="0"/>
-        <w:ind w:hanging="283" w:start="1956"/>
-        <w:rPr/>
-      </w:pPr>
-      <w:r>
-        <w:rPr/>
+        <w:spacing w:before="0" w:after="120"/>
+        <w:ind w:hanging="283" w:start="1956" w:left="0" w:right="0"/>
+        <w:rPr/>
+      </w:pPr>
+      <w:r>
+        <w:rPr>
+          <w:color w:val="000000"/>
+        </w:rPr>
         <w:t xml:space="preserve">单选项是否互斥且穷尽，多选题是否说明选择数量？ </w:t>
       </w:r>
     </w:p>
@@ -1139,12 +1650,14 @@
           <w:tab w:val="left" w:pos="1956" w:leader="none"/>
         </w:tabs>
         <w:bidi w:val="0"/>
-        <w:spacing w:before="0" w:after="0"/>
-        <w:ind w:hanging="283" w:start="1956"/>
-        <w:rPr/>
-      </w:pPr>
-      <w:r>
-        <w:rPr/>
+        <w:spacing w:before="0" w:after="120"/>
+        <w:ind w:hanging="283" w:start="1956" w:left="0" w:right="0"/>
+        <w:rPr/>
+      </w:pPr>
+      <w:r>
+        <w:rPr>
+          <w:color w:val="000000"/>
+        </w:rPr>
         <w:t xml:space="preserve">量表端点、方向和选项数量是否合理？ </w:t>
       </w:r>
     </w:p>
@@ -1160,12 +1673,14 @@
           <w:tab w:val="left" w:pos="1956" w:leader="none"/>
         </w:tabs>
         <w:bidi w:val="0"/>
-        <w:spacing w:before="0" w:after="0"/>
-        <w:ind w:hanging="283" w:start="1956"/>
-        <w:rPr/>
-      </w:pPr>
-      <w:r>
-        <w:rPr/>
+        <w:spacing w:before="0" w:after="120"/>
+        <w:ind w:hanging="283" w:start="1956" w:left="0" w:right="0"/>
+        <w:rPr/>
+      </w:pPr>
+      <w:r>
+        <w:rPr>
+          <w:color w:val="000000"/>
+        </w:rPr>
         <w:t xml:space="preserve">是否删除了与研究无关的身份信息和敏感问题？ </w:t>
       </w:r>
     </w:p>
@@ -1181,19 +1696,21 @@
           <w:tab w:val="left" w:pos="1956" w:leader="none"/>
         </w:tabs>
         <w:bidi w:val="0"/>
-        <w:spacing w:before="0" w:after="283"/>
-        <w:ind w:hanging="283" w:start="1956"/>
-        <w:rPr/>
-      </w:pPr>
-      <w:r>
-        <w:rPr/>
+        <w:spacing w:before="0" w:after="120"/>
+        <w:ind w:hanging="283" w:start="1956" w:left="0" w:right="0"/>
+        <w:rPr/>
+      </w:pPr>
+      <w:r>
+        <w:rPr>
+          <w:color w:val="000000"/>
+        </w:rPr>
         <w:t xml:space="preserve">课堂交互自检：是否完整试填、检查选项和作答流程？若开展正式认知预试，还需邀请目标人群代表，记录对题意的理解、追问、犹豫或误解的位置以及修改依据；平台的试填完成状态不代替这些证据。 </w:t>
       </w:r>
     </w:p>
     <w:sectPr>
       <w:type w:val="nextPage"/>
       <w:pgSz w:w="11906" w:h="16838"/>
-      <w:pgMar w:left="1134" w:right="567" w:gutter="0" w:header="0" w:top="567" w:footer="0" w:bottom="567"/>
+      <w:pgMar w:left="1247" w:right="1247" w:gutter="0" w:header="0" w:top="1247" w:footer="0" w:bottom="1247"/>
       <w:pgNumType w:fmt="decimal"/>
       <w:formProt w:val="false"/>
       <w:textDirection w:val="lrTb"/>
@@ -1879,12 +2396,12 @@
     <w:pPr>
       <w:widowControl w:val="false"/>
       <w:bidi w:val="0"/>
-      <w:spacing w:lineRule="auto" w:line="408" w:before="1247" w:after="1247"/>
-      <w:ind w:start="1247" w:end="1247"/>
+      <w:spacing w:lineRule="auto" w:line="324" w:before="1247" w:after="1247"/>
+      <w:ind w:start="1247" w:end="1247" w:left="0" w:right="0" w:firstLine="0"/>
     </w:pPr>
     <w:rPr>
-      <w:rFonts w:ascii="Noto Sans CJK SC;Microsoft YaHei;sans-serif" w:hAnsi="Noto Sans CJK SC;Microsoft YaHei;sans-serif" w:eastAsia="Noto Sans CJK SC;Microsoft YaHei;sans-serif" w:cs="Noto Sans CJK SC;Microsoft YaHei;sans-serif"/>
-      <w:color w:val="172033"/>
+      <w:rFonts w:ascii="Noto Sans CJK SC" w:hAnsi="Noto Sans CJK SC" w:eastAsia="Noto Sans CJK SC" w:cs="Noto Sans CJK SC;Microsoft YaHei;sans-serif"/>
+      <w:color w:val="000000"/>
       <w:sz w:val="22"/>
       <w:szCs w:val="22"/>
       <w:lang w:val="en-US" w:eastAsia="zh-CN" w:bidi="hi-IN"/>
@@ -1896,14 +2413,16 @@
     <w:next w:val="BodyText"/>
     <w:qFormat/>
     <w:pPr>
-      <w:spacing w:before="240" w:after="227"/>
+      <w:spacing w:before="240" w:after="227" w:line="324" w:lineRule="auto"/>
+      <w:ind w:left="0" w:right="0" w:firstLine="0"/>
       <w:jc w:val="center"/>
     </w:pPr>
     <w:rPr>
+      <w:rFonts w:ascii="Noto Sans CJK SC" w:hAnsi="Noto Sans CJK SC" w:eastAsia="Noto Sans CJK SC"/>
       <w:b/>
       <w:bCs/>
-      <w:color w:val="123D73"/>
-      <w:sz w:val="44"/>
+      <w:color w:val="000000"/>
+      <w:sz w:val="22"/>
       <w:szCs w:val="44"/>
     </w:rPr>
   </w:style>
@@ -1913,18 +2432,16 @@
     <w:next w:val="BodyText"/>
     <w:qFormat/>
     <w:pPr>
-      <w:pBdr>
-        <w:bottom w:val="single" w:sz="2" w:space="3" w:color="9DB6D3"/>
-      </w:pBdr>
-      <w:spacing w:before="397" w:after="120"/>
+      <w:spacing w:before="397" w:after="120" w:line="324" w:lineRule="auto"/>
+      <w:ind w:left="0" w:right="0" w:firstLine="0"/>
       <w:outlineLvl w:val="1"/>
     </w:pPr>
     <w:rPr>
-      <w:rFonts w:ascii="Liberation Serif" w:hAnsi="Liberation Serif" w:eastAsia="Source Han Sans CN" w:cs="Noto Sans Devanagari"/>
+      <w:rFonts w:ascii="Noto Sans CJK SC" w:hAnsi="Noto Sans CJK SC" w:eastAsia="Noto Sans CJK SC" w:cs="Noto Sans Devanagari"/>
       <w:b/>
       <w:bCs/>
-      <w:color w:val="184F8F"/>
-      <w:sz w:val="32"/>
+      <w:color w:val="000000"/>
+      <w:sz w:val="22"/>
       <w:szCs w:val="32"/>
     </w:rPr>
   </w:style>
@@ -1934,15 +2451,16 @@
     <w:next w:val="BodyText"/>
     <w:qFormat/>
     <w:pPr>
-      <w:spacing w:before="283" w:after="120"/>
+      <w:spacing w:before="283" w:after="120" w:line="324" w:lineRule="auto"/>
+      <w:ind w:left="0" w:right="0" w:firstLine="0"/>
       <w:outlineLvl w:val="2"/>
     </w:pPr>
     <w:rPr>
-      <w:rFonts w:ascii="Liberation Serif" w:hAnsi="Liberation Serif" w:eastAsia="Source Han Sans CN" w:cs="Noto Sans Devanagari"/>
+      <w:rFonts w:ascii="Noto Sans CJK SC" w:hAnsi="Noto Sans CJK SC" w:eastAsia="Noto Sans CJK SC" w:cs="Noto Sans Devanagari"/>
       <w:b/>
       <w:bCs/>
-      <w:color w:val="244F7C"/>
-      <w:sz w:val="26"/>
+      <w:color w:val="000000"/>
+      <w:sz w:val="22"/>
       <w:szCs w:val="26"/>
     </w:rPr>
   </w:style>
@@ -2001,29 +2519,42 @@
     <w:next w:val="BodyText"/>
     <w:qFormat/>
     <w:pPr>
-      <w:pBdr>
-        <w:bottom w:val="double" w:sz="2" w:space="0" w:color="808080"/>
-      </w:pBdr>
-      <w:spacing w:before="0" w:after="283"/>
+      <w:spacing w:before="0" w:after="283" w:line="324" w:lineRule="auto"/>
+      <w:ind w:left="0" w:right="0" w:firstLine="0"/>
     </w:pPr>
     <w:rPr>
-      <w:sz w:val="12"/>
+      <w:rFonts w:ascii="Noto Sans CJK SC" w:hAnsi="Noto Sans CJK SC" w:eastAsia="Noto Sans CJK SC"/>
+      <w:color w:val="000000"/>
+      <w:sz w:val="22"/>
     </w:rPr>
   </w:style>
   <w:style w:type="paragraph" w:styleId="EnvelopeReturn">
     <w:name w:val="envelope return"/>
     <w:basedOn w:val="Normal"/>
-    <w:pPr/>
+    <w:pPr>
+      <w:spacing w:line="324" w:lineRule="auto"/>
+      <w:ind w:left="0" w:right="0" w:firstLine="0"/>
+    </w:pPr>
     <w:rPr>
+      <w:rFonts w:ascii="Noto Sans CJK SC" w:hAnsi="Noto Sans CJK SC" w:eastAsia="Noto Sans CJK SC"/>
       <w:i/>
+      <w:color w:val="000000"/>
+      <w:sz w:val="22"/>
     </w:rPr>
   </w:style>
   <w:style w:type="paragraph" w:styleId="TableContents">
     <w:name w:val="Table Contents"/>
     <w:basedOn w:val="BodyText"/>
     <w:qFormat/>
-    <w:pPr/>
-    <w:rPr/>
+    <w:pPr>
+      <w:spacing w:line="324" w:lineRule="auto"/>
+      <w:ind w:left="0" w:right="0" w:firstLine="0"/>
+    </w:pPr>
+    <w:rPr>
+      <w:rFonts w:ascii="Noto Sans CJK SC" w:hAnsi="Noto Sans CJK SC" w:eastAsia="Noto Sans CJK SC"/>
+      <w:color w:val="000000"/>
+      <w:sz w:val="22"/>
+    </w:rPr>
   </w:style>
   <w:style w:type="paragraph" w:styleId="Index">
     <w:name w:val="Index"/>
@@ -2031,9 +2562,13 @@
     <w:qFormat/>
     <w:pPr>
       <w:suppressLineNumbers/>
+      <w:spacing w:line="324" w:lineRule="auto"/>
+      <w:ind w:left="0" w:right="0" w:firstLine="0"/>
     </w:pPr>
     <w:rPr>
-      <w:rFonts w:cs="Noto Sans Devanagari"/>
+      <w:rFonts w:cs="Noto Sans Devanagari" w:ascii="Noto Sans CJK SC" w:hAnsi="Noto Sans CJK SC" w:eastAsia="Noto Sans CJK SC"/>
+      <w:color w:val="000000"/>
+      <w:sz w:val="22"/>
     </w:rPr>
   </w:style>
   <w:style w:type="paragraph" w:styleId="Caption">
@@ -2042,31 +2577,43 @@
     <w:qFormat/>
     <w:pPr>
       <w:suppressLineNumbers/>
-      <w:spacing w:before="120" w:after="120"/>
+      <w:spacing w:before="120" w:after="120" w:line="324" w:lineRule="auto"/>
+      <w:ind w:left="0" w:right="0" w:firstLine="0"/>
     </w:pPr>
     <w:rPr>
-      <w:rFonts w:cs="Noto Sans Devanagari"/>
+      <w:rFonts w:cs="Noto Sans Devanagari" w:ascii="Noto Sans CJK SC" w:hAnsi="Noto Sans CJK SC" w:eastAsia="Noto Sans CJK SC"/>
       <w:i/>
       <w:iCs/>
-      <w:sz w:val="24"/>
+      <w:color w:val="000000"/>
+      <w:sz w:val="22"/>
       <w:szCs w:val="24"/>
     </w:rPr>
   </w:style>
   <w:style w:type="paragraph" w:styleId="List">
     <w:name w:val="List"/>
     <w:basedOn w:val="BodyText"/>
-    <w:pPr/>
+    <w:pPr>
+      <w:spacing w:line="324" w:lineRule="auto"/>
+      <w:ind w:left="0" w:right="0" w:firstLine="0"/>
+    </w:pPr>
     <w:rPr>
-      <w:rFonts w:cs="Noto Sans Devanagari"/>
+      <w:rFonts w:cs="Noto Sans Devanagari" w:ascii="Noto Sans CJK SC" w:hAnsi="Noto Sans CJK SC" w:eastAsia="Noto Sans CJK SC"/>
+      <w:color w:val="000000"/>
+      <w:sz w:val="22"/>
     </w:rPr>
   </w:style>
   <w:style w:type="paragraph" w:styleId="BodyText">
     <w:name w:val="Body Text"/>
     <w:basedOn w:val="Normal"/>
     <w:pPr>
-      <w:spacing w:before="0" w:after="283"/>
+      <w:spacing w:before="0" w:after="283" w:line="324" w:lineRule="auto"/>
+      <w:ind w:left="0" w:right="0" w:firstLine="0"/>
     </w:pPr>
-    <w:rPr/>
+    <w:rPr>
+      <w:rFonts w:ascii="Noto Sans CJK SC" w:hAnsi="Noto Sans CJK SC" w:eastAsia="Noto Sans CJK SC"/>
+      <w:color w:val="000000"/>
+      <w:sz w:val="22"/>
+    </w:rPr>
   </w:style>
   <w:style w:type="paragraph" w:styleId="Heading">
     <w:name w:val="Heading"/>
@@ -2075,11 +2622,13 @@
     <w:qFormat/>
     <w:pPr>
       <w:keepNext w:val="true"/>
-      <w:spacing w:before="240" w:after="283"/>
+      <w:spacing w:before="240" w:after="283" w:line="324" w:lineRule="auto"/>
+      <w:ind w:left="0" w:right="0" w:firstLine="0"/>
     </w:pPr>
     <w:rPr>
-      <w:rFonts w:ascii="Liberation Sans" w:hAnsi="Liberation Sans"/>
-      <w:sz w:val="28"/>
+      <w:rFonts w:ascii="Noto Sans CJK SC" w:hAnsi="Noto Sans CJK SC" w:eastAsia="Noto Sans CJK SC"/>
+      <w:color w:val="000000"/>
+      <w:sz w:val="22"/>
       <w:szCs w:val="28"/>
     </w:rPr>
   </w:style>
@@ -2088,23 +2637,28 @@
     <w:basedOn w:val="BodyText"/>
     <w:qFormat/>
     <w:pPr>
-      <w:pBdr>
-        <w:top w:val="single" w:sz="2" w:space="10" w:color="9DB6D3"/>
-        <w:left w:val="single" w:sz="2" w:space="10" w:color="9DB6D3"/>
-        <w:bottom w:val="single" w:sz="2" w:space="10" w:color="9DB6D3"/>
-        <w:right w:val="single" w:sz="2" w:space="10" w:color="9DB6D3"/>
-      </w:pBdr>
       <w:shd w:fill="EEF5FC" w:val="clear"/>
+      <w:spacing w:line="324" w:lineRule="auto"/>
+      <w:ind w:left="0" w:right="0" w:firstLine="0"/>
     </w:pPr>
-    <w:rPr/>
+    <w:rPr>
+      <w:rFonts w:ascii="Noto Sans CJK SC" w:hAnsi="Noto Sans CJK SC" w:eastAsia="Noto Sans CJK SC"/>
+      <w:color w:val="000000"/>
+      <w:sz w:val="22"/>
+    </w:rPr>
   </w:style>
   <w:style w:type="paragraph" w:styleId="BodyTextplaceholder">
     <w:name w:val="Body Text.placeholder"/>
     <w:basedOn w:val="BodyText"/>
     <w:qFormat/>
-    <w:pPr/>
+    <w:pPr>
+      <w:spacing w:line="324" w:lineRule="auto"/>
+      <w:ind w:left="0" w:right="0" w:firstLine="0"/>
+    </w:pPr>
     <w:rPr>
-      <w:color w:val="4F657D"/>
+      <w:rFonts w:ascii="Noto Sans CJK SC" w:hAnsi="Noto Sans CJK SC" w:eastAsia="Noto Sans CJK SC"/>
+      <w:color w:val="000000"/>
+      <w:sz w:val="22"/>
     </w:rPr>
   </w:style>
   <w:style w:type="paragraph" w:styleId="TableHeading">
@@ -2114,13 +2668,20 @@
     <w:pPr>
       <w:suppressLineNumbers/>
       <w:shd w:fill="E4EEF9" w:val="clear"/>
+      <w:spacing w:line="324" w:lineRule="auto"/>
+      <w:ind w:left="0" w:right="0" w:firstLine="0"/>
       <w:jc w:val="center"/>
     </w:pPr>
     <w:rPr>
+      <w:rFonts w:ascii="Noto Sans CJK SC" w:hAnsi="Noto Sans CJK SC" w:eastAsia="Noto Sans CJK SC"/>
       <w:b/>
       <w:bCs/>
-      <w:color w:val="123D73"/>
+      <w:color w:val="000000"/>
+      <w:sz w:val="22"/>
     </w:rPr>
+  </w:style>
+  <w:style w:type="paragraph" w:customStyle="1" w:styleId="Title">
+    <w:name w:val="Title"/>
   </w:style>
 </w:styles>
 </file>

</xml_diff>